<commit_message>
Edition 6: Address Governor & WN remarks (handcuffs legalization 12.8.1 UK, autonomous procedural norms)
Co-authored-by: arena-agent <297053741+arena-agent@users.noreply.github.com>
</commit_message>
<xml_diff>
--- a/Законы/Законопроекты/ACT. 001 — Изменения в Процессуальный кодекс.docx
+++ b/Законы/Законопроекты/ACT. 001 — Изменения в Процессуальный кодекс.docx
@@ -705,7 +705,7 @@
                 <w:szCs w:val="24"/>
                 <w:shd w:val="clear" w:color="auto" w:fill="D9EAD3"/>
               </w:rPr>
-              <w:t xml:space="preserve">на основании судебного акта либо ордера типа Access to Raid (AR) или Access to Cordon (AC), авторизованного в порядке, установленном законом «О системе ордеров штата San-Andreas», с указанием в ордере подлежащего обыску жилища. Без судебного акта и ордера обыск жилища допускается только в случаях, предусмотренных частью 4 настоящей статьи.</w:t>
+              <w:t xml:space="preserve">на основании вступившего в законную силу судебного акта либо ордера Генерального прокурора штата San-Andreas, его заместителей или суда на проведение рейда (Access to Raid, AR) или оцепления с правом обыска (Access to Cordon, AC), в котором прямо указан адрес или индивидуализирующие признаки подлежащего обыску помещения. Без судебного акта и ордера обыск жилища допускается только в случаях, предусмотренных частью 4 настоящей статьи.</w:t>
             </w:r>
             <w:r>
               <w:rPr>
@@ -753,7 +753,7 @@
                 <w:szCs w:val="24"/>
                 <w:shd w:val="clear" w:color="auto" w:fill="D9EAD3"/>
               </w:rPr>
-              <w:t xml:space="preserve">производится на основании судебного акта либо ордера типа Access to Raid (AR) или Access to Cordon (AC), авторизованного в порядке, установленном законом «О системе ордеров штата San-Andreas».</w:t>
+              <w:t xml:space="preserve">производится на основании судебного акта либо ордера Генерального прокурора штата San-Andreas, его заместителей или суда на проведение рейда (Access to Raid, AR) или оцепления с правом обыска (Access to Cordon, AC), в котором прямо указан адрес помещения.</w:t>
             </w:r>
           </w:p>
           <w:p>
@@ -906,7 +906,7 @@
                 <w:szCs w:val="24"/>
                 <w:shd w:val="clear" w:color="auto" w:fill="D9EAD3"/>
               </w:rPr>
-              <w:t xml:space="preserve">ч. 2. Правоохранительными органами (ПОО), осуществляющими уголовное и административное преследование, расследование правонарушений, задержание и арест в полном объёме процессуальных действий, в целях настоящего Кодекса признаются региональные правоохранительные органы (LSPD, LSCSD) и федеральный правоохранительный орган (FIB). USSS является специализированной службой государственной безопасности и охраны, сотрудники которой осуществляют задержание лиц на охраняемых объектах, при проведении защитных миссий, а также на основании ордеров и судебных актов, с последующей передачей задержанных в LSPD, LSCSD или FIB в порядке статьи 17.3 настоящего Кодекса. ОГП участвует в задержании и проводит процессуальные действия в пределах полномочий, установленных настоящим Кодексом и Конституционным Законом «О деятельности офиса Генерального прокурора штата San-Andreas».</w:t>
+              <w:t xml:space="preserve">ч. 2. Правоохранительными органами (ПОО), осуществляющими уголовное и административное преследование, расследование правонарушений, задержание и арест в полном объёме процессуальных действий, в целях настоящего Кодекса признаются региональные правоохранительные органы (LSPD, LSCSD) и федеральный правоохранительный орган (FIB). USSS является специализированной службой государственной безопасности и охраны, сотрудники которой осуществляют задержание лиц на охраняемых объектах, при проведении защитных миссий, а также на основании ордеров и судебных актов, с последующей передачей задержанных в LSPD, LSCSD или FIB в порядке статьи 17.3 настоящего Кодекса. ОГП участвует в задержании и проводит процессуальные действия в пределах надзорных полномочий, установленных статьями 40–41 Конституции штата San-Andreas и настоящим Кодексом.</w:t>
             </w:r>
           </w:p>
           <w:p>
@@ -2929,7 +2929,7 @@
                 <w:szCs w:val="24"/>
                 <w:shd w:val="clear" w:color="auto" w:fill="D9EAD3"/>
               </w:rPr>
-              <w:t xml:space="preserve">в) сотрудники WN — в случаях, предусмотренных статьёй 17.1 настоящего Кодекса.</w:t>
+              <w:t xml:space="preserve">в) сотрудники WN — в отношении лица, совершившего правонарушение на территории охраняемых объектов WN в соответствии со статьёй 17.1 настоящего Кодекса (уполномоченные сотрудники WN в целях обеспечения безопасности офиса и задержания вправе приобретать, хранить при себе, носить и применять наручники);</w:t>
             </w:r>
           </w:p>
           <w:p>
@@ -4412,7 +4412,7 @@
                 <w:szCs w:val="24"/>
                 <w:shd w:val="clear" w:color="auto" w:fill="D9EAD3"/>
               </w:rPr>
-              <w:t xml:space="preserve">ч. 6. Задержание лица, обладающего статусом неприкосновенности, производится с соблюдением закона «Об обеспечении неприкосновенности государственных служащих штата San-Andreas» и закона «О системе ордеров штата San-Andreas».</w:t>
+              <w:t xml:space="preserve">ч. 6. Лицо, обладающее статусом неприкосновенности, может быть задержано исключительно при непосредственной угрозе жизни граждан, застигнутое на месте преступления против жизни, либо при наличии вступившего в законную силу судебного акта или ордера на приостановление (SI) или снятие (RI, AS) неприкосновенности. О факте задержания немедленно уведомляется ОГП, а предельный срок ожидания решения уполномоченных лиц о выдаче ордера не может превышать 1 часа с момента доставления, после чего задержанное лицо подлежит немедленному освобождению.</w:t>
             </w:r>
           </w:p>
         </w:tc>

</xml_diff>

<commit_message>
Edition 8: Generalize all external cross-references to действующее законодательство while keeping internal references sharp
Co-authored-by: arena-agent <297053741+arena-agent@users.noreply.github.com>
</commit_message>
<xml_diff>
--- a/Законы/Законопроекты/ACT. 001 — Изменения в Процессуальный кодекс.docx
+++ b/Законы/Законопроекты/ACT. 001 — Изменения в Процессуальный кодекс.docx
@@ -768,7 +768,7 @@
                 <w:szCs w:val="24"/>
                 <w:shd w:val="clear" w:color="auto" w:fill="D9EAD3"/>
               </w:rPr>
-              <w:t xml:space="preserve">ч. 4. Без судебного акта и ордера проникновение в жилое или нежилое помещение допускается только: при пресечении совершаемого в нем преступления; при преследовании по горячим следам лица, подозреваемого в совершении преступления; для устранения непосредственной угрозы жизни или здоровью находящихся в нем лиц; при проведении контртеррористической операции; в период действия чрезвычайного или военного положения в пределах, установленных законом. О каждом таком случае прокурор уведомляется в порядке части 2 настоящей статьи. Основания проникновения в помещения без ордера, предусмотренные законами о деятельности отдельных государственных органов, применяются в части, не противоречащей настоящей статье.</w:t>
+              <w:t xml:space="preserve">ч. 4. Без судебного акта и ордера проникновение в жилое или нежилое помещение допускается только: при пресечении совершаемого в нем преступления; при преследовании по горячим следам лица, подозреваемого в совершении преступления; для устранения непосредственной угрозы жизни или здоровью находящихся в нем лиц; при проведении контртеррористической операции; в период действия чрезвычайного или военного положения в пределах, установленных законом. О каждом таком случае прокурор уведомляется в порядке части 2 настоящей статьи. Основания проникновения в помещения без ордера, предусмотренные действующим законодательством штата San-Andreas, применяются в части, не противоречащей настоящей статье.</w:t>
             </w:r>
           </w:p>
         </w:tc>
@@ -906,7 +906,7 @@
                 <w:szCs w:val="24"/>
                 <w:shd w:val="clear" w:color="auto" w:fill="D9EAD3"/>
               </w:rPr>
-              <w:t xml:space="preserve">ч. 2. Правоохранительными органами (ПОО), осуществляющими уголовное и административное преследование, расследование правонарушений, задержание и арест в полном объёме процессуальных действий, в целях настоящего Кодекса признаются региональные правоохранительные органы (LSPD, LSCSD) и федеральный правоохранительный орган (FIB). USSS является специализированной службой государственной безопасности и охраны, сотрудники которой осуществляют задержание лиц на охраняемых объектах, при проведении защитных миссий, а также на основании ордеров и судебных актов, с последующей передачей задержанных в LSPD, LSCSD или FIB в порядке статьи 17.3 настоящего Кодекса. ОГП участвует в задержании и проводит процессуальные действия в пределах надзорных полномочий, установленных статьями 40–41 Конституции штата San-Andreas и настоящим Кодексом.</w:t>
+              <w:t xml:space="preserve">ч. 2. Правоохранительными органами (ПОО), осуществляющими уголовное и административное преследование, расследование правонарушений, задержание и арест в полном объёме процессуальных действий, в целях настоящего Кодекса признаются региональные правоохранительные органы (LSPD, LSCSD) и федеральный правоохранительный орган (FIB). USSS является специализированной службой государственной безопасности и охраны, сотрудники которой осуществляют задержание лиц на охраняемых объектах, при проведении защитных миссий, а также на основании ордеров и судебных актов, с последующей передачей задержанных в LSPD, LSCSD или FIB в порядке статьи 17.3 настоящего Кодекса. ОГП участвует в задержании и проводит процессуальные действия в пределах надзорных полномочий, установленных настоящим Кодексом и действующим законодательством штата San-Andreas.</w:t>
             </w:r>
           </w:p>
           <w:p>
@@ -4367,7 +4367,7 @@
                 <w:szCs w:val="24"/>
                 <w:shd w:val="clear" w:color="auto" w:fill="D9EAD3"/>
               </w:rPr>
-              <w:t xml:space="preserve">В остальных случаях сведения о правонарушении передаются в ОГП и руководству указанного лица без его задержания. Гарантии правовой защиты, установленные законами о деятельности отдельных государственных органов и об адвокатуре, применяются в части, не противоречащей настоящей части.</w:t>
+              <w:t xml:space="preserve">В остальных случаях сведения о правонарушении передаются в ОГП и руководству указанного лица без его задержания. Гарантии правовой защиты, установленные действующим законодательством штата San-Andreas, применяются в части, не противоречащей настоящей части.</w:t>
             </w:r>
           </w:p>
           <w:p>
@@ -4861,7 +4861,7 @@
                 <w:szCs w:val="24"/>
                 <w:shd w:val="clear" w:color="auto" w:fill="D9EAD3"/>
               </w:rPr>
-              <w:t xml:space="preserve">неприкосновенности, за исключением случаев, когда его задержание допускается законом «Об обеспечении неприкосновенности государственных служащих штата San-Andreas» (задержание при совершении преступления, связанного с посягательством на жизнь, либо на основании ордера);</w:t>
+              <w:t xml:space="preserve">неприкосновенности, за исключением случаев, когда его задержание допускается частью 6 статьи 19 настоящего Кодекса и действующим законодательством штата San-Andreas;</w:t>
             </w:r>
           </w:p>
           <w:p>

</xml_diff>